<commit_message>
Rev2 round-2 updates: two-line subtitle, cream A Memoir, remove front credentials, first-person back-cover draft
Front: subtitle set to two lines; 'A Memoir' recolored to the title cream with
added space; author credentials removed from the front. Back: description reset
in the author's first-person voice (draft to replace with approved copy).
Regenerated both tonal options, full wraps, back-cover comp, and the 200px test;
brief updated to match.

Co-Authored-By: Claude Opus 4.8 <noreply@anthropic.com>
Claude-Session: https://claude.ai/code/session_01HgndQ1X8EGE1cvxGzWYirU
</commit_message>
<xml_diff>
--- a/deliverables/rev2-the-stories-we-told/The-Stories-We-Told_Rev2-Brief.docx
+++ b/deliverables/rev2-the-stories-we-told/The-Stories-We-Told_Rev2-Brief.docx
@@ -172,7 +172,7 @@
           <w:sz w:val="21"/>
           <w:szCs w:val="21"/>
         </w:rPr>
-        <w:t xml:space="preserve">Set below the existing subtitle in the same oxblood small capitals, at a smaller size, with the same letterspacing. Nothing on the cover currently identifies this as narrative nonfiction, which affects both retail shelving and online discoverability.</w:t>
+        <w:t xml:space="preserve">Set below the subtitle in small capitals with the same letterspacing, at a smaller size — but in the title’s cream/ivory rather than oxblood, so it reads as a distinct line and not part of the subtitle. Add clear space above it. Nothing on the cover currently identifies this as narrative nonfiction, which affects both retail shelving and online discoverability.</w:t>
       </w:r>
     </w:p>
     <w:p>
@@ -200,16 +200,90 @@
           <w:sz w:val="21"/>
           <w:szCs w:val="21"/>
         </w:rPr>
-        <w:t xml:space="preserve">Replace the back-cover copy in full.  </w:t>
-      </w:r>
-      <w:r>
-        <w:rPr>
-          <w:rFonts w:ascii="Georgia" w:cs="Georgia" w:eastAsia="Georgia" w:hAnsi="Georgia"/>
-          <w:color w:val="1F1B1A"/>
-          <w:sz w:val="21"/>
-          <w:szCs w:val="21"/>
-        </w:rPr>
-        <w:t xml:space="preserve">The current text is third person and does not appear in the book. Use the approved first-person copy below. Keep the existing type size, leading, and column width.</w:t>
+        <w:t xml:space="preserve">Set the subtitle as two lines.  </w:t>
+      </w:r>
+      <w:r>
+        <w:rPr>
+          <w:rFonts w:ascii="Georgia" w:cs="Georgia" w:eastAsia="Georgia" w:hAnsi="Georgia"/>
+          <w:color w:val="1F1B1A"/>
+          <w:sz w:val="21"/>
+          <w:szCs w:val="21"/>
+        </w:rPr>
+        <w:t xml:space="preserve">Break “THE DANCE BETWEEN A CODEPENDENT AND A COMPULSIVE LIAR” across two lines rather than three, keeping the oxblood small caps and centered alignment.</w:t>
+      </w:r>
+    </w:p>
+    <w:p>
+      <w:pPr>
+        <w:spacing w:after="130"/>
+        <w:jc w:val="both"/>
+      </w:pPr>
+      <w:r>
+        <w:rPr>
+          <w:rFonts w:ascii="Georgia" w:cs="Georgia" w:eastAsia="Georgia" w:hAnsi="Georgia"/>
+          <w:b/>
+          <w:bCs/>
+          <w:color w:val="9B4A44"/>
+          <w:sz w:val="21"/>
+          <w:szCs w:val="21"/>
+        </w:rPr>
+        <w:t xml:space="preserve">4.  </w:t>
+      </w:r>
+      <w:r>
+        <w:rPr>
+          <w:rFonts w:ascii="Georgia" w:cs="Georgia" w:eastAsia="Georgia" w:hAnsi="Georgia"/>
+          <w:b/>
+          <w:bCs/>
+          <w:color w:val="1F1B1A"/>
+          <w:sz w:val="21"/>
+          <w:szCs w:val="21"/>
+        </w:rPr>
+        <w:t xml:space="preserve">Remove the credentials under the author name (front).  </w:t>
+      </w:r>
+      <w:r>
+        <w:rPr>
+          <w:rFonts w:ascii="Georgia" w:cs="Georgia" w:eastAsia="Georgia" w:hAnsi="Georgia"/>
+          <w:color w:val="1F1B1A"/>
+          <w:sz w:val="21"/>
+          <w:szCs w:val="21"/>
+        </w:rPr>
+        <w:t xml:space="preserve">Delete “PSY.D., LPCMH, NCC” beneath NIKI SERRAVALLE on the front cover. The credentials remain in the author bio on the back.</w:t>
+      </w:r>
+    </w:p>
+    <w:p>
+      <w:pPr>
+        <w:spacing w:after="130"/>
+        <w:jc w:val="both"/>
+      </w:pPr>
+      <w:r>
+        <w:rPr>
+          <w:rFonts w:ascii="Georgia" w:cs="Georgia" w:eastAsia="Georgia" w:hAnsi="Georgia"/>
+          <w:b/>
+          <w:bCs/>
+          <w:color w:val="9B4A44"/>
+          <w:sz w:val="21"/>
+          <w:szCs w:val="21"/>
+        </w:rPr>
+        <w:t xml:space="preserve">5.  </w:t>
+      </w:r>
+      <w:r>
+        <w:rPr>
+          <w:rFonts w:ascii="Georgia" w:cs="Georgia" w:eastAsia="Georgia" w:hAnsi="Georgia"/>
+          <w:b/>
+          <w:bCs/>
+          <w:color w:val="1F1B1A"/>
+          <w:sz w:val="21"/>
+          <w:szCs w:val="21"/>
+        </w:rPr>
+        <w:t xml:space="preserve">Replace the back-cover description in full.  </w:t>
+      </w:r>
+      <w:r>
+        <w:rPr>
+          <w:rFonts w:ascii="Georgia" w:cs="Georgia" w:eastAsia="Georgia" w:hAnsi="Georgia"/>
+          <w:color w:val="1F1B1A"/>
+          <w:sz w:val="21"/>
+          <w:szCs w:val="21"/>
+        </w:rPr>
+        <w:t xml:space="preserve">The current description is third person and does not appear in the book. Use the author’s first-person voice. Keep the existing type size, leading, and column width. The author bio may remain in third person, as is conventional. A first-person DRAFT (converted from the current text) is provided below — replace it with the approved book copy.</w:t>
       </w:r>
     </w:p>
     <w:p>
@@ -240,7 +314,49 @@
           <w:sz w:val="19"/>
           <w:szCs w:val="19"/>
         </w:rPr>
-        <w:t xml:space="preserve">Paste the approved first-person back-cover copy here before this page goes to the designer — it was not included with the memo:</w:t>
+        <w:t xml:space="preserve">DRAFT for placement only — replace with the approved first-person copy:</w:t>
+      </w:r>
+    </w:p>
+    <w:p>
+      <w:pPr>
+        <w:pBdr>
+          <w:left w:val="dashed" w:color="C9BDB6" w:sz="8" w:space="10"/>
+        </w:pBdr>
+        <w:spacing w:after="90"/>
+        <w:ind w:left="360"/>
+      </w:pPr>
+      <w:r>
+        <w:rPr>
+          <w:rFonts w:ascii="Georgia" w:cs="Georgia" w:eastAsia="Georgia" w:hAnsi="Georgia"/>
+          <w:i/>
+          <w:iCs/>
+          <w:color w:val="1F1B1A"/>
+          <w:sz w:val="20"/>
+          <w:szCs w:val="20"/>
+        </w:rPr>
+        <w:t xml:space="preserve">In </w:t>
+      </w:r>
+      <w:r>
+        <w:rPr>
+          <w:rFonts w:ascii="Georgia" w:cs="Georgia" w:eastAsia="Georgia" w:hAnsi="Georgia"/>
+          <w:i/>
+          <w:iCs/>
+          <w:color w:val="1F1B1A"/>
+          <w:sz w:val="20"/>
+          <w:szCs w:val="20"/>
+        </w:rPr>
+        <w:t xml:space="preserve">The Stories We Told</w:t>
+      </w:r>
+      <w:r>
+        <w:rPr>
+          <w:rFonts w:ascii="Georgia" w:cs="Georgia" w:eastAsia="Georgia" w:hAnsi="Georgia"/>
+          <w:i/>
+          <w:iCs/>
+          <w:color w:val="1F1B1A"/>
+          <w:sz w:val="20"/>
+          <w:szCs w:val="20"/>
+        </w:rPr>
+        <w:t xml:space="preserve">, I examine the intimate and disorienting bond between a codependent and a compulsive liar. Through a deeply personal memoir, I trace the emotional logic of attachment, the seduction of explanation, and the slow unraveling that occurs when love becomes organized around confusion, rescue, and self-betrayal.</w:t>
       </w:r>
     </w:p>
     <w:p>
@@ -256,11 +372,11 @@
           <w:rFonts w:ascii="Georgia" w:cs="Georgia" w:eastAsia="Georgia" w:hAnsi="Georgia"/>
           <w:i/>
           <w:iCs/>
-          <w:color w:val="6E6763"/>
+          <w:color w:val="1F1B1A"/>
           <w:sz w:val="20"/>
           <w:szCs w:val="20"/>
         </w:rPr>
-        <w:t xml:space="preserve">[ FIRST-PERSON BACK-COVER COPY — TO BE PASTED HERE ]</w:t>
+        <w:t xml:space="preserve">This is a story about longing, self-deception, trauma, and the narratives we build to survive what we cannot yet bear to name. With psychological insight and emotional precision, I invite you into the complicated dance between truth and illusion — and the cost of confusing being chosen with being loved.</w:t>
       </w:r>
     </w:p>
     <w:p>
@@ -277,7 +393,7 @@
           <w:sz w:val="21"/>
           <w:szCs w:val="21"/>
         </w:rPr>
-        <w:t xml:space="preserve">4.  </w:t>
+        <w:t xml:space="preserve">6.  </w:t>
       </w:r>
       <w:r>
         <w:rPr>
@@ -345,7 +461,7 @@
           <w:sz w:val="21"/>
           <w:szCs w:val="21"/>
         </w:rPr>
-        <w:t xml:space="preserve">5.  </w:t>
+        <w:t xml:space="preserve">7.  </w:t>
       </w:r>
       <w:r>
         <w:rPr>
@@ -382,7 +498,7 @@
           <w:sz w:val="21"/>
           <w:szCs w:val="21"/>
         </w:rPr>
-        <w:t xml:space="preserve">6.  </w:t>
+        <w:t xml:space="preserve">8.  </w:t>
       </w:r>
       <w:r>
         <w:rPr>
@@ -450,7 +566,7 @@
           <w:sz w:val="21"/>
           <w:szCs w:val="21"/>
         </w:rPr>
-        <w:t xml:space="preserve">7.  </w:t>
+        <w:t xml:space="preserve">9.  </w:t>
       </w:r>
       <w:r>
         <w:rPr>
@@ -487,7 +603,7 @@
           <w:sz w:val="21"/>
           <w:szCs w:val="21"/>
         </w:rPr>
-        <w:t xml:space="preserve">8.  </w:t>
+        <w:t xml:space="preserve">10.  </w:t>
       </w:r>
       <w:r>
         <w:rPr>
@@ -600,7 +716,7 @@
           <w:sz w:val="18"/>
           <w:szCs w:val="18"/>
         </w:rPr>
-        <w:t xml:space="preserve">The following reference comps are attached to this revision (see the accompanying image files). They apply the achievable subset of the notes above directly to the flattened cover — the two tonal-lift options, quotation removed, “A Memoir” added, the male figure pushed back, and the fracture reduced — for direction only. Final production art (back-cover retypeset, portrait swap) should be executed in the layered source file.</w:t>
+        <w:t xml:space="preserve">The following reference comps are attached to this revision (see the accompanying image files). They apply the notes above directly to the flattened cover — the two tonal-lift options, quotation removed, “A Memoir” added in cream with space, the subtitle set to two lines, the front credentials removed, the back-cover description reset in first person (draft), the male figure pushed back, and the fracture reduced — for direction only. Final production art should be executed in the layered source file (and the author-photo swap needs the supplied duotone file).</w:t>
       </w:r>
     </w:p>
     <w:p>

</xml_diff>

<commit_message>
Warm-duotone headshot; update back cover bio, website, and remove em dash
Warm the author headshot to a soft duotone to match the palette. Update the
author bio (clinical psychological evaluation; nature-based sciences; integrated
trauma care), change the website to balancedlivingde.com, and remove the em dash
from the back-cover description. Regenerate comps; brief updated to match.

Co-Authored-By: Claude Opus 4.8 <noreply@anthropic.com>
Claude-Session: https://claude.ai/code/session_01HgndQ1X8EGE1cvxGzWYirU
</commit_message>
<xml_diff>
--- a/deliverables/rev2-the-stories-we-told/The-Stories-We-Told_Rev2-Brief.docx
+++ b/deliverables/rev2-the-stories-we-told/The-Stories-We-Told_Rev2-Brief.docx
@@ -376,7 +376,7 @@
           <w:sz w:val="20"/>
           <w:szCs w:val="20"/>
         </w:rPr>
-        <w:t xml:space="preserve">This is a story about longing, self-deception, trauma, and the narratives we build to survive what we cannot yet bear to name. With psychological insight and emotional precision, I invite you into the complicated dance between truth and illusion — and the cost of confusing being chosen with being loved.</w:t>
+        <w:t xml:space="preserve">This is a story about longing, self-deception, trauma, and the narratives we build to survive what we cannot yet bear to name. With psychological insight and emotional precision, I invite you into the complicated dance between truth and illusion, and the cost of confusing being chosen with being loved.</w:t>
       </w:r>
     </w:p>
     <w:p>
@@ -413,7 +413,65 @@
           <w:sz w:val="21"/>
           <w:szCs w:val="21"/>
         </w:rPr>
-        <w:t xml:space="preserve">Use the supplied warm-duotone file. The current photo is cool gray on a warm ground and reads as pasted in rather than designed.</w:t>
+        <w:t xml:space="preserve">Supplied studio headshot placed on the back cover, softly warmed to a duotone to match the palette (black-and-white with a gentle warm tone). The soft hair was sharpened to recover strand detail.</w:t>
+      </w:r>
+    </w:p>
+    <w:p>
+      <w:pPr>
+        <w:spacing w:after="40" w:before="60"/>
+      </w:pPr>
+      <w:r>
+        <w:rPr>
+          <w:rFonts w:ascii="Georgia" w:cs="Georgia" w:eastAsia="Georgia" w:hAnsi="Georgia"/>
+          <w:b/>
+          <w:bCs/>
+          <w:color w:val="9B4A44"/>
+          <w:sz w:val="20"/>
+          <w:szCs w:val="20"/>
+        </w:rPr>
+        <w:t xml:space="preserve">Additional round-2 corrections</w:t>
+      </w:r>
+    </w:p>
+    <w:p>
+      <w:pPr>
+        <w:spacing w:after="40"/>
+      </w:pPr>
+      <w:r>
+        <w:rPr>
+          <w:rFonts w:ascii="Georgia" w:cs="Georgia" w:eastAsia="Georgia" w:hAnsi="Georgia"/>
+          <w:color w:val="1F1B1A"/>
+          <w:sz w:val="20"/>
+          <w:szCs w:val="20"/>
+        </w:rPr>
+        <w:t xml:space="preserve">• Website: change to balancedlivingde.com (not nikiserravalle.com).</w:t>
+      </w:r>
+    </w:p>
+    <w:p>
+      <w:pPr>
+        <w:spacing w:after="40"/>
+      </w:pPr>
+      <w:r>
+        <w:rPr>
+          <w:rFonts w:ascii="Georgia" w:cs="Georgia" w:eastAsia="Georgia" w:hAnsi="Georgia"/>
+          <w:color w:val="1F1B1A"/>
+          <w:sz w:val="20"/>
+          <w:szCs w:val="20"/>
+        </w:rPr>
+        <w:t xml:space="preserve">• Author bio: “a psychologist specializing in clinical psychological evaluation, and a trauma-informed therapist … at the intersection of psychology, nature-based sciences, integrated trauma care, and the human stories that shape who we become.” (Replaces “clinical assessment specialist” and “neuroscience.”)</w:t>
+      </w:r>
+    </w:p>
+    <w:p>
+      <w:pPr>
+        <w:spacing w:after="160"/>
+      </w:pPr>
+      <w:r>
+        <w:rPr>
+          <w:rFonts w:ascii="Georgia" w:cs="Georgia" w:eastAsia="Georgia" w:hAnsi="Georgia"/>
+          <w:color w:val="1F1B1A"/>
+          <w:sz w:val="20"/>
+          <w:szCs w:val="20"/>
+        </w:rPr>
+        <w:t xml:space="preserve">• No em dashes anywhere in the cover copy.</w:t>
       </w:r>
     </w:p>
     <w:p>

</xml_diff>